<commit_message>
Prepare validated 1.0.0 production release for review
</commit_message>
<xml_diff>
--- a/docs/guides/Delphi App Translation Studio Engineering Guide.docx
+++ b/docs/guides/Delphi App Translation Studio Engineering Guide.docx
@@ -110,9 +110,9 @@
           <w:color w:val="5D7693"/>
           <w:sz w:val="22"/>
         </w:rPr>
-        <w:t>Version 1.0</w:t>
+        <w:t>Version 1.0.0</w:t>
         <w:br/>
-        <w:t>Last changed: September 1, 2026</w:t>
+        <w:t>Last changed: September 30, 2026</w:t>
         <w:br/>
         <w:t>Windows • Delphi VCL and FireMonkey • Win32 and Win64</w:t>
       </w:r>
@@ -27542,7 +27542,7 @@
         <w:t xml:space="preserve">Why it matters: </w:t>
       </w:r>
       <w:r>
-        <w:t>Primary pre-release gate across foundation, scanner, runtime, components, Studio, and artifacts.</w:t>
+        <w:t>Primary release-validation gate across foundation, scanner, runtime, components, Studio, and artifacts.</w:t>
       </w:r>
     </w:p>
     <w:p>

</xml_diff>